<commit_message>
Simplify reunion lesson reading and restore early textbook questions
Pair all 16 paragraphs with existing comics, restore early comprehension tasks, explain the narrative thread before fill-in practice, and emphasize quotation functions. Preserve prior answers and vocabulary records; synchronize teaching slides and downloads.
</commit_message>
<xml_diff>
--- a/du/textbook/1hcl/unit2/tuanyuanfan/downloads/tuanyuanfan-teacher-guide.docx
+++ b/du/textbook/1hcl/unit2/tuanyuanfan/downloads/tuanyuanfan-teacher-guide.docx
@@ -20,7 +20,7 @@
     </w:p>
     <w:p>
       <w:r>
-        <w:t>本课以课本第42—43页的问题为主线，整合为七组任务。学生先回文定位，再解释人物行为、事物线索与主题，最后完成有理由的开放回应。漫画只用于帮助理解当前段落，作答依据回到原文。</w:t>
+        <w:t>本课以课本问题为主线，整合为九组任务。学生先回文定位，再解释人物行为、事物线索与主题，最后完成有理由的开放回应。漫画只用于帮助理解当前段落，作答依据回到原文。</w:t>
       </w:r>
     </w:p>
     <w:p>
@@ -247,7 +247,7 @@
                 <w:b w:val="0"/>
                 <w:sz w:val="20"/>
               </w:rPr>
-              <w:t>导入4分钟；初读12分钟；任务1—2共12分钟；任务3用6分钟；人物短答与订正12分钟；词语整理4分钟。</w:t>
+              <w:t>导入3分钟；初读10分钟；任务1—2共8分钟；任务3—4共12分钟；任务5用4分钟；人物短答10分钟；词语整理3分钟。</w:t>
             </w:r>
           </w:p>
         </w:tc>
@@ -277,9 +277,9 @@
                 <w:b w:val="0"/>
                 <w:sz w:val="20"/>
               </w:rPr>
-              <w:t>任务1—4</w:t>
+              <w:t>任务1—6</w:t>
               <w:br/>
-              <w:t>课件1—16页</w:t>
+              <w:t>课件1—20页</w:t>
             </w:r>
           </w:p>
         </w:tc>
@@ -376,9 +376,9 @@
                 <w:b w:val="0"/>
                 <w:sz w:val="20"/>
               </w:rPr>
-              <w:t>任务5—7</w:t>
+              <w:t>任务7—9</w:t>
               <w:br/>
-              <w:t>课件17—28页</w:t>
+              <w:t>课件21—32页</w:t>
             </w:r>
           </w:p>
         </w:tc>
@@ -398,6 +398,209 @@
         <w:pageBreakBefore/>
       </w:pPr>
       <w:r>
+        <w:t>第一课 先读懂前面的段落</w:t>
+      </w:r>
+    </w:p>
+    <w:p>
+      <w:pPr>
+        <w:pStyle w:val="Heading2"/>
+        <w:spacing w:after="60"/>
+      </w:pPr>
+      <w:r>
+        <w:t>任务1 时间与成长</w:t>
+      </w:r>
+    </w:p>
+    <w:p>
+      <w:pPr>
+        <w:spacing w:after="60" w:line="300" w:lineRule="exact"/>
+      </w:pPr>
+      <w:r>
+        <w:rPr>
+          <w:b/>
+        </w:rPr>
+        <w:t>课本问题：</w:t>
+      </w:r>
+      <w:r>
+        <w:t>为什么说时间是个神偷？作者所谓的“成长的定律”指的是什么？</w:t>
+      </w:r>
+    </w:p>
+    <w:p>
+      <w:pPr>
+        <w:spacing w:after="60" w:line="300" w:lineRule="exact"/>
+      </w:pPr>
+      <w:r>
+        <w:rPr>
+          <w:b/>
+        </w:rPr>
+        <w:t>学生操作：</w:t>
+      </w:r>
+      <w:r>
+        <w:t>读第一段和第三段，分别回答两个问题。</w:t>
+      </w:r>
+    </w:p>
+    <w:p>
+      <w:pPr>
+        <w:spacing w:after="60" w:line="300" w:lineRule="exact"/>
+      </w:pPr>
+      <w:r>
+        <w:rPr>
+          <w:b/>
+        </w:rPr>
+        <w:t>参考回答：</w:t>
+      </w:r>
+      <w:r>
+        <w:t>时间在人们不知不觉中使妈妈衰老，悄悄带走她的青春，所以说它是“神偷”。“成长的定律”指“我”长大后逐渐有自己的想法和审美，与妈妈不同：妈妈喜欢大红色，“我”却觉得它有点土气。</w:t>
+      </w:r>
+    </w:p>
+    <w:p>
+      <w:pPr>
+        <w:spacing w:after="60" w:line="300" w:lineRule="exact"/>
+      </w:pPr>
+      <w:r>
+        <w:rPr>
+          <w:b/>
+        </w:rPr>
+        <w:t>解释：</w:t>
+      </w:r>
+      <w:r>
+        <w:t>第一段的“白发更多”“添了新的鱼尾纹”写妈妈逐渐衰老；“神偷”突出时间的变化不易察觉。</w:t>
+      </w:r>
+    </w:p>
+    <w:p>
+      <w:pPr>
+        <w:spacing w:after="60" w:line="300" w:lineRule="exact"/>
+      </w:pPr>
+      <w:r>
+        <w:rPr>
+          <w:b/>
+        </w:rPr>
+        <w:t>解释：</w:t>
+      </w:r>
+      <w:r>
+        <w:t>第三段用母子对红色的不同看法说明成长中的变化，不能扩大成所有青少年都反对父母。</w:t>
+      </w:r>
+    </w:p>
+    <w:p>
+      <w:pPr>
+        <w:spacing w:after="60" w:line="300" w:lineRule="exact"/>
+      </w:pPr>
+      <w:r>
+        <w:rPr>
+          <w:b/>
+        </w:rPr>
+        <w:t>提示次序：</w:t>
+      </w:r>
+      <w:r>
+        <w:t>想想“偷”有什么特点，再比较母子对红色的看法。 → 看第一段“白发”“鱼尾纹”，再看第三段“喜欢”“不太喜欢”。</w:t>
+      </w:r>
+    </w:p>
+    <w:p>
+      <w:pPr>
+        <w:pStyle w:val="Heading2"/>
+        <w:spacing w:after="60"/>
+      </w:pPr>
+      <w:r>
+        <w:t>任务2 喜庆与愁容</w:t>
+      </w:r>
+    </w:p>
+    <w:p>
+      <w:pPr>
+        <w:spacing w:after="60" w:line="300" w:lineRule="exact"/>
+      </w:pPr>
+      <w:r>
+        <w:rPr>
+          <w:b/>
+        </w:rPr>
+        <w:t>课本问题：</w:t>
+      </w:r>
+      <w:r>
+        <w:t>为什么“此时的她和墙上新贴的‘年年有余’显得格格不入”？</w:t>
+      </w:r>
+    </w:p>
+    <w:p>
+      <w:pPr>
+        <w:spacing w:after="60" w:line="300" w:lineRule="exact"/>
+      </w:pPr>
+      <w:r>
+        <w:rPr>
+          <w:b/>
+        </w:rPr>
+        <w:t>学生操作：</w:t>
+      </w:r>
+      <w:r>
+        <w:t>比较新年字样的气氛和妈妈的神态。</w:t>
+      </w:r>
+    </w:p>
+    <w:p>
+      <w:pPr>
+        <w:spacing w:after="60" w:line="300" w:lineRule="exact"/>
+      </w:pPr>
+      <w:r>
+        <w:rPr>
+          <w:b/>
+        </w:rPr>
+        <w:t>参考回答：</w:t>
+      </w:r>
+      <w:r>
+        <w:t>“年年有余”是喜庆的祝福语，妈妈却铁青着脸、一直皱着眉，显得不开心。喜庆的字样与她的愁容不协调，所以说两者“格格不入”。</w:t>
+      </w:r>
+    </w:p>
+    <w:p>
+      <w:pPr>
+        <w:spacing w:after="60" w:line="300" w:lineRule="exact"/>
+      </w:pPr>
+      <w:r>
+        <w:rPr>
+          <w:b/>
+        </w:rPr>
+        <w:t>解释：</w:t>
+      </w:r>
+      <w:r>
+        <w:t>第四段将“年年有余”的喜庆祝福与妈妈“铁青着脸”“皱着眉”的神态放在一起，形成反差。</w:t>
+      </w:r>
+    </w:p>
+    <w:p>
+      <w:pPr>
+        <w:spacing w:after="60" w:line="300" w:lineRule="exact"/>
+      </w:pPr>
+      <w:r>
+        <w:rPr>
+          <w:b/>
+        </w:rPr>
+        <w:t>解释：</w:t>
+      </w:r>
+      <w:r>
+        <w:t>第五段交代她为姐姐的事闹别扭。解释“格格不入”时，要说清喜庆与不快这两边。</w:t>
+      </w:r>
+    </w:p>
+    <w:p>
+      <w:pPr>
+        <w:spacing w:after="60" w:line="300" w:lineRule="exact"/>
+      </w:pPr>
+      <w:r>
+        <w:rPr>
+          <w:b/>
+        </w:rPr>
+        <w:t>提示次序：</w:t>
+      </w:r>
+      <w:r>
+        <w:t>一边是新年字样，一边是人的表情：两边给人的感受一样吗？ → 第四段找“铁青着脸”“皱着眉”，再想“年年有余”表达什么祝愿。</w:t>
+      </w:r>
+    </w:p>
+    <w:p>
+      <w:pPr>
+        <w:spacing w:after="60" w:line="300" w:lineRule="exact"/>
+      </w:pPr>
+      <w:r>
+        <w:t>先依据第一段解释时间使人不知不觉衰老，再用第三段的审美差异解释成长。第四段必须比较喜庆祝福与愁容两边；第五段补足人物心事的原因。</w:t>
+      </w:r>
+    </w:p>
+    <w:p>
+      <w:pPr>
+        <w:pStyle w:val="Heading1"/>
+        <w:pageBreakBefore/>
+      </w:pPr>
+      <w:r>
         <w:t>第一课 以原文回答课本问题</w:t>
       </w:r>
     </w:p>
@@ -407,7 +610,7 @@
         <w:spacing w:after="60"/>
       </w:pPr>
       <w:r>
-        <w:t>任务1 姐姐和哥哥为何缺席</w:t>
+        <w:t>任务3 姐姐和哥哥为何缺席</w:t>
       </w:r>
     </w:p>
     <w:p>
@@ -486,7 +689,7 @@
         <w:spacing w:after="60"/>
       </w:pPr>
       <w:r>
-        <w:t>任务2 父母有什么反应</w:t>
+        <w:t>任务4 父母有什么反应</w:t>
       </w:r>
     </w:p>
     <w:p>
@@ -579,7 +782,7 @@
         <w:spacing w:after="60"/>
       </w:pPr>
       <w:r>
-        <w:t>任务3 “我”做了什么</w:t>
+        <w:t>任务5 “我”做了什么</w:t>
       </w:r>
     </w:p>
     <w:p>
@@ -680,7 +883,7 @@
         <w:pStyle w:val="Heading2"/>
       </w:pPr>
       <w:r>
-        <w:t>任务4 从行为看人物特点</w:t>
+        <w:t>任务6 从行为看人物特点</w:t>
       </w:r>
     </w:p>
     <w:p>
@@ -759,7 +962,7 @@
         <w:pStyle w:val="Heading2"/>
       </w:pPr>
       <w:r>
-        <w:t>任务5 事物线索与主题</w:t>
+        <w:t>任务7 事物线索与主题</w:t>
       </w:r>
     </w:p>
     <w:p>
@@ -781,7 +984,7 @@
         <w:t>作答框架：</w:t>
       </w:r>
       <w:r>
-        <w:t>点段号回读，找出反复出现、串起各件事的同一个事物，再概括主题。</w:t>
+        <w:t>先认识线索，再填入贯穿这些事情的同一个事物。</w:t>
       </w:r>
     </w:p>
     <w:p>
@@ -836,7 +1039,7 @@
         <w:t>图示操作：</w:t>
       </w:r>
       <w:r>
-        <w:t>依次查看第2、4、6、12、13、14、16段，寻找反复出现且串起事情的事物。用“准备—缺席—围炉关心—期待团圆”梳理内容，再区分“用什么串起来”与“表达什么感情”。</w:t>
+        <w:t>先用“线串珠子”解释线索，把几件事连接起来；再读第2、4、6、12、13、14、16段，在空格中填写“团圆饭”。网页只需填写一次，七行内容同步显示；最后概括这些事情表达的感情。</w:t>
       </w:r>
     </w:p>
     <w:p>
@@ -1006,7 +1209,8 @@
             </w:pPr>
             <w:r>
               <w:rPr>
-                <w:b w:val="0"/>
+                <w:b/>
+                <w:color w:val="A33226"/>
                 <w:sz w:val="20"/>
               </w:rPr>
               <w:t>对话</w:t>
@@ -1103,7 +1307,8 @@
             </w:pPr>
             <w:r>
               <w:rPr>
-                <w:b w:val="0"/>
+                <w:b/>
+                <w:color w:val="A33226"/>
                 <w:sz w:val="20"/>
               </w:rPr>
               <w:t>引用别人的话</w:t>
@@ -1200,7 +1405,8 @@
             </w:pPr>
             <w:r>
               <w:rPr>
-                <w:b w:val="0"/>
+                <w:b/>
+                <w:color w:val="A33226"/>
                 <w:sz w:val="20"/>
               </w:rPr>
               <w:t>特别的说法、名称</w:t>
@@ -1297,7 +1503,8 @@
             </w:pPr>
             <w:r>
               <w:rPr>
-                <w:b w:val="0"/>
+                <w:b/>
+                <w:color w:val="A33226"/>
                 <w:sz w:val="20"/>
               </w:rPr>
               <w:t>借用的词语</w:t>
@@ -1394,7 +1601,8 @@
             </w:pPr>
             <w:r>
               <w:rPr>
-                <w:b w:val="0"/>
+                <w:b/>
+                <w:color w:val="A33226"/>
                 <w:sz w:val="20"/>
               </w:rPr>
               <w:t>强调的词语</w:t>
@@ -1975,12 +2183,12 @@
     </w:p>
     <w:p>
       <w:r>
-        <w:t>初读只按当前段落提供一格局部漫画，按需展开，帮助学生进入情境。学生回到左侧原文，点选自己读懂的一句并保留。任务1—3必须提交文字证据；人物题和开放题必须自己解释。完整漫画集中在课后回读页。</w:t>
+        <w:t>读文区一次显示一段。左侧是该段完整原文，右侧漫画上方标明“第一段”等对应段号，直接呈现该段的漫画，下面是课文词语积累。保留现有漫画全部画面及文字，不增加展开或记下原句操作。任务3—5保留文字证据，人物题和开放题由学生自己解释。</w:t>
       </w:r>
     </w:p>
     <w:p>
       <w:r>
-        <w:t>不要用强制看满几秒、机械点击“已读”证明理解。看图可以降低语言困难，理解是否成立仍由原文证据和学生的解释判断。学生选中一句原文只表示留下阅读痕迹，不等同于已掌握。</w:t>
+        <w:t>学生可用上一段、下一段或段号菜单切换。看图帮助进入情境，随后在理解题中用原文依据解释意思。读文页不再要求选一句原文才继续。</w:t>
       </w:r>
     </w:p>
     <w:p>
@@ -2016,7 +2224,7 @@
     </w:p>
     <w:p>
       <w:r>
-        <w:t>人物题、主题和开放题保存首次回答及后续订正，但不自动评分。客观任务记录首次正确率。题目变更后不把旧答案错套到新题，旧版记录仍可下载。所有记录默认留在学生本机，不自动发送给教师。</w:t>
+        <w:t>人物题、主题和开放题保存首次回答及后续订正，但不自动评分。客观任务记录首次正确率。原七题的答案按题意对应到新编号，首次回答和订正保留，旧版记录仍可下载。所有记录默认留在学生本机，不自动发送给教师。</w:t>
       </w:r>
     </w:p>
     <w:p>
@@ -2029,7 +2237,7 @@
     </w:p>
     <w:p>
       <w:r>
-        <w:t>课本问题、段号、线索材料和引号分类已对应；人物题改为自主短答；开放题保留解释义务；新短文已移除。答案及释义区分课文事实、语境解释与个人观点。教师按意思审阅，不机械按字数或关键词判分。</w:t>
+        <w:t>前段三道课本问题已经恢复；16段图文逐段对应；先讲线索再填空；引号五种作用名称均用红色粗体强调；人物题改为自主短答；开放题保留解释义务；新短文已移除。答案及释义区分课文事实、语境解释与个人观点。教师按意思审阅，不机械按字数或关键词判分。</w:t>
       </w:r>
     </w:p>
     <w:sectPr>

</xml_diff>